<commit_message>
Declutter resume and address ATS checker findings
Shorter one-line bullets with varied verbs, quantified scope (10,000+
users, 50+ Domain Controllers), explicit job title and location, roomier
typography, and trimmed sections (drops school record, gender-neutral
award wording).

Co-Authored-By: Claude Opus 5.5 <noreply@anthropic.com>
Claude-Session: https://claude.ai/code/session_01VbUC1yQeE2ZKXsQwtu7PFh
</commit_message>
<xml_diff>
--- a/resume/Athi_Shree_V_Resume.docx
+++ b/resume/Athi_Shree_V_Resume.docx
@@ -28,7 +28,7 @@
           <w:i w:val="0"/>
           <w:sz w:val="21"/>
         </w:rPr>
-        <w:t>Active Directory &amp; Microsoft Entra ID (Azure AD) Administrator | Identity &amp; Access Management (IAM)</w:t>
+        <w:t>L3 Active Directory &amp; Microsoft Entra ID Administrator</w:t>
       </w:r>
     </w:p>
     <w:p>
@@ -42,7 +42,7 @@
           <w:i w:val="0"/>
           <w:sz w:val="19"/>
         </w:rPr>
-        <w:t>+91 63795 44624 | vathishree@gmail.com | linkedin.com/in/athisree-venkat-845660190</w:t>
+        <w:t>Chennai, India | +91 63795 44624 | vathishree@gmail.com | linkedin.com/in/athisree-venkat-845660190</w:t>
       </w:r>
     </w:p>
     <w:p>
@@ -65,14 +65,13 @@
     <w:p>
       <w:pPr>
         <w:spacing w:after="0" w:before="0"/>
-        <w:jc w:val="both"/>
       </w:pPr>
       <w:r>
         <w:rPr>
           <w:b w:val="0"/>
           <w:i w:val="0"/>
         </w:rPr>
-        <w:t>Active Directory and Microsoft Entra ID (Azure AD) Administrator with 3.8 years of experience in enterprise Identity and Access Management (IAM) for global banking and life-sciences clients. L2/L3 expertise in AD DS, Domain Controllers, AD replication, Group Policy (GPO), DNS, DHCP and LDAP, plus hybrid identity with Microsoft Entra Connect, SAML SSO, MFA, Conditional Access and RBAC. SC-300 certified; uses PowerShell and disciplined incident and change management to keep access secure.</w:t>
+        <w:t>Active Directory and Microsoft Entra ID (Azure AD) Administrator with 3.8 years of experience in Identity and Access Management (IAM) for banking and life-sciences enterprises. Supports 10,000+ users and 50+ Domain Controllers, specializing in AD replication, Group Policy, DNS, DHCP, hybrid identity, SSO, MFA and Conditional Access. Microsoft Certified: Identity and Access Administrator (SC-300).</w:t>
       </w:r>
     </w:p>
     <w:p>
@@ -101,10 +100,10 @@
           <w:b/>
           <w:color w:val="1F4E79"/>
         </w:rPr>
-        <w:t xml:space="preserve">Identity &amp; Directory Services: </w:t>
+        <w:t xml:space="preserve">Active Directory: </w:t>
       </w:r>
       <w:r>
-        <w:t>Active Directory (AD DS), Microsoft Entra ID (Azure AD), Domain Controllers, AD Sites and Services, AD Replication, LDAP, Organizational Units (OUs), Security &amp; Distribution Groups, Service Accounts, Delegation, ACLs, SPN / Kerberos</w:t>
+        <w:t>AD DS, Domain Controllers, AD Sites and Services, Replication, Group Policy (GPO), LDAP, Kerberos, OUs, Delegation</w:t>
       </w:r>
     </w:p>
     <w:p>
@@ -116,10 +115,10 @@
           <w:b/>
           <w:color w:val="1F4E79"/>
         </w:rPr>
-        <w:t xml:space="preserve">Access Management &amp; Security: </w:t>
+        <w:t xml:space="preserve">Microsoft Entra ID: </w:t>
       </w:r>
       <w:r>
-        <w:t>Identity and Access Management (IAM), Multi-Factor Authentication (MFA), Conditional Access, SAML, Single Sign-On (SSO), Role-Based Access Control (RBAC), Enterprise Applications, Group-Based Licensing, Sign-in &amp; Audit Logs, Least Privilege</w:t>
+        <w:t>Azure AD, Entra Connect, Hybrid Identity, Conditional Access, MFA, SAML SSO, RBAC, Enterprise Apps</w:t>
       </w:r>
     </w:p>
     <w:p>
@@ -131,10 +130,10 @@
           <w:b/>
           <w:color w:val="1F4E79"/>
         </w:rPr>
-        <w:t xml:space="preserve">Hybrid Identity &amp; Cloud: </w:t>
+        <w:t xml:space="preserve">Infrastructure: </w:t>
       </w:r>
       <w:r>
-        <w:t>Microsoft Entra Connect (Azure AD Connect), Hybrid Identity, Microsoft 365, Exchange Online, Microsoft Azure</w:t>
+        <w:t>Windows Server, DNS, DHCP, NTFS Permissions, Exchange Online, Microsoft 365</w:t>
       </w:r>
     </w:p>
     <w:p>
@@ -146,25 +145,10 @@
           <w:b/>
           <w:color w:val="1F4E79"/>
         </w:rPr>
-        <w:t xml:space="preserve">Windows Server Infrastructure: </w:t>
+        <w:t xml:space="preserve">Tools &amp; Processes: </w:t>
       </w:r>
       <w:r>
-        <w:t>DNS (Zones, Records, Conditional Forwarders, Zone Transfers), DHCP (Scopes, Reservations, Failover), Group Policy (GPO), File Share &amp; NTFS Permissions</w:t>
-      </w:r>
-    </w:p>
-    <w:p>
-      <w:pPr>
-        <w:spacing w:after="20" w:before="0"/>
-      </w:pPr>
-      <w:r>
-        <w:rPr>
-          <w:b/>
-          <w:color w:val="1F4E79"/>
-        </w:rPr>
-        <w:t xml:space="preserve">Automation &amp; IT Operations: </w:t>
-      </w:r>
-      <w:r>
-        <w:t>PowerShell Scripting, Incident Management, Change Management, Patching, Disaster Recovery (DR), Root Cause Analysis, L2/L3 Troubleshooting</w:t>
+        <w:t>PowerShell, Incident Management, Change Management, Patching, Disaster Recovery</w:t>
       </w:r>
     </w:p>
     <w:p>
@@ -195,7 +179,7 @@
         <w:rPr>
           <w:b/>
         </w:rPr>
-        <w:t>Associate | Cognizant Technology Solutions</w:t>
+        <w:t>Active Directory Administrator</w:t>
       </w:r>
       <w:r>
         <w:rPr>
@@ -203,6 +187,18 @@
         </w:rPr>
         <w:tab/>
         <w:t>Dec 2022 – Present</w:t>
+      </w:r>
+    </w:p>
+    <w:p>
+      <w:pPr>
+        <w:spacing w:after="40" w:before="0"/>
+      </w:pPr>
+      <w:r>
+        <w:rPr>
+          <w:b w:val="0"/>
+          <w:i w:val="0"/>
+        </w:rPr>
+        <w:t>Cognizant Technology Solutions | Associate | Chennai, India</w:t>
       </w:r>
     </w:p>
     <w:p>
@@ -224,7 +220,7 @@
           <w:b/>
         </w:rPr>
         <w:tab/>
-        <w:t>Current Project</w:t>
+        <w:t>Current</w:t>
       </w:r>
     </w:p>
     <w:p>
@@ -233,7 +229,7 @@
         <w:spacing w:after="20"/>
       </w:pPr>
       <w:r>
-        <w:t>Deliver L3 Active Directory administration and advanced troubleshooting, managing Domain Controller health, AD replication, authentication and core AD DS services across the enterprise.</w:t>
+        <w:t>Administer Active Directory for 10,000+ user accounts, resolving L3 identity and access escalations.</w:t>
       </w:r>
     </w:p>
     <w:p>
@@ -242,7 +238,7 @@
         <w:spacing w:after="20"/>
       </w:pPr>
       <w:r>
-        <w:t>Administer Group Policy (GPO): troubleshoot, validate and optimize policy application and security settings across the domain.</w:t>
+        <w:t>Monitor health and replication of 50+ Domain Controllers across multiple AD sites.</w:t>
       </w:r>
     </w:p>
     <w:p>
@@ -251,7 +247,7 @@
         <w:spacing w:after="20"/>
       </w:pPr>
       <w:r>
-        <w:t>Maintain AD Sites and Services, subnets and replication topology to ensure reliable domain connectivity and authentication across locations.</w:t>
+        <w:t>Optimize Group Policy processing and security baselines for domain-joined users and computers.</w:t>
       </w:r>
     </w:p>
     <w:p>
@@ -260,7 +256,7 @@
         <w:spacing w:after="20"/>
       </w:pPr>
       <w:r>
-        <w:t>Troubleshoot LDAP authentication, AD security permissions (ACLs), delegation, service accounts and SPN / Kerberos-related access issues.</w:t>
+        <w:t>Resolve LDAP, Kerberos/SPN, ACL and service-account issues that block application sign-in.</w:t>
       </w:r>
     </w:p>
     <w:p>
@@ -269,16 +265,7 @@
         <w:spacing w:after="20"/>
       </w:pPr>
       <w:r>
-        <w:t>Support Microsoft Entra ID (Azure AD) enterprise application access, Conditional Access policies and RBAC role assignments.</w:t>
-      </w:r>
-    </w:p>
-    <w:p>
-      <w:pPr>
-        <w:pStyle w:val="ListBullet"/>
-        <w:spacing w:after="20"/>
-      </w:pPr>
-      <w:r>
-        <w:t>Handle incident and change activities end to end for security-focused access requests, coordinating validation, implementation and closure.</w:t>
+        <w:t>Deliver Entra ID feature requests for enterprise apps, Conditional Access and RBAC, from design to closure.</w:t>
       </w:r>
     </w:p>
     <w:p>
@@ -300,7 +287,7 @@
           <w:b/>
         </w:rPr>
         <w:tab/>
-        <w:t>Previous Project</w:t>
+        <w:t>Previous</w:t>
       </w:r>
     </w:p>
     <w:p>
@@ -309,7 +296,7 @@
         <w:spacing w:after="20"/>
       </w:pPr>
       <w:r>
-        <w:t>Provisioned and managed AD user and service accounts, security and distribution groups, OUs and delegated access in line with security policies and least-privilege principles.</w:t>
+        <w:t>Provisioned user and service accounts, groups and OUs using least-privilege delegation.</w:t>
       </w:r>
     </w:p>
     <w:p>
@@ -318,7 +305,7 @@
         <w:spacing w:after="20"/>
       </w:pPr>
       <w:r>
-        <w:t>Administered Domain Controllers, DNS integration and AD replication; investigated and resolved authentication and replication issues.</w:t>
+        <w:t>Maintained Domain Controllers, AD-integrated DNS and replication; diagnosed authentication failures.</w:t>
       </w:r>
     </w:p>
     <w:p>
@@ -327,7 +314,7 @@
         <w:spacing w:after="20"/>
       </w:pPr>
       <w:r>
-        <w:t>Created, maintained and troubleshot Group Policy Objects (GPOs) to enforce security standards.</w:t>
+        <w:t>Rolled out MFA, Conditional Access and group-based licensing in Microsoft Entra ID.</w:t>
       </w:r>
     </w:p>
     <w:p>
@@ -336,7 +323,7 @@
         <w:spacing w:after="20"/>
       </w:pPr>
       <w:r>
-        <w:t>Managed Microsoft Entra ID users and groups; implemented MFA, Conditional Access and group-based license provisioning.</w:t>
+        <w:t>Configured SAML single sign-on and Entra Connect hybrid synchronization.</w:t>
       </w:r>
     </w:p>
     <w:p>
@@ -345,16 +332,7 @@
         <w:spacing w:after="20"/>
       </w:pPr>
       <w:r>
-        <w:t>Configured SAML Single Sign-On (SSO) and Microsoft Entra Connect for hybrid identity; reviewed audit and sign-in logs to secure access.</w:t>
-      </w:r>
-    </w:p>
-    <w:p>
-      <w:pPr>
-        <w:pStyle w:val="ListBullet"/>
-        <w:spacing w:after="20"/>
-      </w:pPr>
-      <w:r>
-        <w:t>Administered DNS and DHCP (records, conditional forwarders, zone transfers, scopes, reservations, failover), file share and RBAC permissions, and Exchange Online mailboxes and mail flow.</w:t>
+        <w:t>Ran DNS and DHCP operations: zones, forwarders, scopes, reservations and failover.</w:t>
       </w:r>
     </w:p>
     <w:p>
@@ -423,9 +401,6 @@
         <w:t>B.E., Computer Science and Engineering</w:t>
       </w:r>
       <w:r>
-        <w:t xml:space="preserve"> | Sri Venkateswara College of Engineering | CGPA: 9.23 / 10</w:t>
-      </w:r>
-      <w:r>
         <w:rPr>
           <w:b/>
         </w:rPr>
@@ -435,26 +410,14 @@
     </w:p>
     <w:p>
       <w:pPr>
-        <w:tabs>
-          <w:tab w:pos="10181" w:val="right"/>
-        </w:tabs>
-        <w:spacing w:after="0" w:before="40"/>
+        <w:spacing w:after="40" w:before="0"/>
       </w:pPr>
       <w:r>
         <w:rPr>
-          <w:b/>
+          <w:b w:val="0"/>
+          <w:i w:val="0"/>
         </w:rPr>
-        <w:t>Higher Secondary (HSLC)</w:t>
-      </w:r>
-      <w:r>
-        <w:t xml:space="preserve"> | Holy Cross Anglo Indian Higher Secondary School | Score: 86%</w:t>
-      </w:r>
-      <w:r>
-        <w:rPr>
-          <w:b/>
-        </w:rPr>
-        <w:tab/>
-        <w:t>2016 – 2018</w:t>
+        <w:t>Sri Venkateswara College of Engineering | CGPA 9.23/10</w:t>
       </w:r>
     </w:p>
     <w:p>
@@ -480,7 +443,7 @@
         <w:spacing w:after="20"/>
       </w:pPr>
       <w:r>
-        <w:t>Recognized as a top ticket-closure contributor in the core IT support team and received the Women Rising Star special mention for ticket resolution and team collaboration.</w:t>
+        <w:t>Rising Star special mention for ticket resolution and team collaboration.</w:t>
       </w:r>
     </w:p>
     <w:p>
@@ -489,7 +452,7 @@
         <w:spacing w:after="20"/>
       </w:pPr>
       <w:r>
-        <w:t>Collaborated with automation teams to streamline recurring service requests and improve operational efficiency.</w:t>
+        <w:t>Top ticket-closure contributor in the core IT support team.</w:t>
       </w:r>
     </w:p>
     <w:p>
@@ -498,7 +461,7 @@
         <w:spacing w:after="20"/>
       </w:pPr>
       <w:r>
-        <w:t>Trained and mentored new IT support hires on technical procedures and support workflows.</w:t>
+        <w:t>Mentored new IT support hires on procedures and support workflows.</w:t>
       </w:r>
     </w:p>
     <w:sectPr>

</xml_diff>

<commit_message>
Restore full resume detail with cleaner alignment; add tools
Brings back the original bullets, skills, schooling and award wording,
keeps the added scope numbers and location, aligns education dates on
one line, and adds a Tools & Platforms skill line (ServiceNow, Splunk,
New Relic, PagerDuty, SailPoint, Quest Change Auditor, Citrix).

Co-Authored-By: Claude Opus 5.5 <noreply@anthropic.com>
Claude-Session: https://claude.ai/code/session_01VbUC1yQeE2ZKXsQwtu7PFh
</commit_message>
<xml_diff>
--- a/resume/Athi_Shree_V_Resume.docx
+++ b/resume/Athi_Shree_V_Resume.docx
@@ -28,7 +28,7 @@
           <w:i w:val="0"/>
           <w:sz w:val="21"/>
         </w:rPr>
-        <w:t>L3 Active Directory &amp; Microsoft Entra ID Administrator</w:t>
+        <w:t>Active Directory &amp; Microsoft Entra ID (Azure AD) Administrator | Identity &amp; Access Management (IAM)</w:t>
       </w:r>
     </w:p>
     <w:p>
@@ -71,7 +71,7 @@
           <w:b w:val="0"/>
           <w:i w:val="0"/>
         </w:rPr>
-        <w:t>Active Directory and Microsoft Entra ID (Azure AD) Administrator with 3.8 years of experience in Identity and Access Management (IAM) for banking and life-sciences enterprises. Supports 10,000+ users and 50+ Domain Controllers, specializing in AD replication, Group Policy, DNS, DHCP, hybrid identity, SSO, MFA and Conditional Access. Microsoft Certified: Identity and Access Administrator (SC-300).</w:t>
+        <w:t>Active Directory and Microsoft Entra ID (Azure AD) Administrator with 3.8 years of experience in enterprise Identity and Access Management (IAM) for global banking and life-sciences clients, supporting 10,000+ users and 50+ Domain Controllers. L2/L3 expertise in AD DS, AD replication, Group Policy (GPO), DNS, DHCP and LDAP, plus hybrid identity with Microsoft Entra Connect, SAML SSO, MFA, Conditional Access and RBAC. SC-300 certified; uses PowerShell, ServiceNow and Splunk to deliver secure, well-controlled incident and change management.</w:t>
       </w:r>
     </w:p>
     <w:p>
@@ -100,10 +100,10 @@
           <w:b/>
           <w:color w:val="1F4E79"/>
         </w:rPr>
-        <w:t xml:space="preserve">Active Directory: </w:t>
+        <w:t xml:space="preserve">Identity &amp; Directory: </w:t>
       </w:r>
       <w:r>
-        <w:t>AD DS, Domain Controllers, AD Sites and Services, Replication, Group Policy (GPO), LDAP, Kerberos, OUs, Delegation</w:t>
+        <w:t>Active Directory (AD DS), Entra ID (Azure AD), Domain Controllers, AD Sites and Services, AD Replication, LDAP, OUs, Security &amp; Distribution Groups, Service Accounts, Delegation, ACLs, SPN/Kerberos</w:t>
       </w:r>
     </w:p>
     <w:p>
@@ -115,10 +115,10 @@
           <w:b/>
           <w:color w:val="1F4E79"/>
         </w:rPr>
-        <w:t xml:space="preserve">Microsoft Entra ID: </w:t>
+        <w:t xml:space="preserve">Access &amp; Security: </w:t>
       </w:r>
       <w:r>
-        <w:t>Azure AD, Entra Connect, Hybrid Identity, Conditional Access, MFA, SAML SSO, RBAC, Enterprise Apps</w:t>
+        <w:t>IAM, Multi-Factor Authentication (MFA), Conditional Access, SAML, Single Sign-On (SSO), RBAC, Enterprise Applications, Group-Based Licensing, Sign-in &amp; Audit Logs, Least Privilege</w:t>
       </w:r>
     </w:p>
     <w:p>
@@ -130,10 +130,10 @@
           <w:b/>
           <w:color w:val="1F4E79"/>
         </w:rPr>
-        <w:t xml:space="preserve">Infrastructure: </w:t>
+        <w:t xml:space="preserve">Hybrid &amp; Cloud: </w:t>
       </w:r>
       <w:r>
-        <w:t>Windows Server, DNS, DHCP, NTFS Permissions, Exchange Online, Microsoft 365</w:t>
+        <w:t>Microsoft Entra Connect (Azure AD Connect), Hybrid Identity, Microsoft 365, Exchange Online, Azure</w:t>
       </w:r>
     </w:p>
     <w:p>
@@ -145,10 +145,40 @@
           <w:b/>
           <w:color w:val="1F4E79"/>
         </w:rPr>
-        <w:t xml:space="preserve">Tools &amp; Processes: </w:t>
+        <w:t xml:space="preserve">Windows Infrastructure: </w:t>
       </w:r>
       <w:r>
-        <w:t>PowerShell, Incident Management, Change Management, Patching, Disaster Recovery</w:t>
+        <w:t>DNS (Zones, Records, Conditional Forwarders, Zone Transfers), DHCP (Scopes, Reservations, Failover), Group Policy (GPO), File Share &amp; NTFS Permissions</w:t>
+      </w:r>
+    </w:p>
+    <w:p>
+      <w:pPr>
+        <w:spacing w:after="20" w:before="0"/>
+      </w:pPr>
+      <w:r>
+        <w:rPr>
+          <w:b/>
+          <w:color w:val="1F4E79"/>
+        </w:rPr>
+        <w:t xml:space="preserve">Tools &amp; Platforms: </w:t>
+      </w:r>
+      <w:r>
+        <w:t>ServiceNow, Splunk, New Relic, PagerDuty, SailPoint, Quest Change Auditor, Citrix, PowerShell</w:t>
+      </w:r>
+    </w:p>
+    <w:p>
+      <w:pPr>
+        <w:spacing w:after="20" w:before="0"/>
+      </w:pPr>
+      <w:r>
+        <w:rPr>
+          <w:b/>
+          <w:color w:val="1F4E79"/>
+        </w:rPr>
+        <w:t xml:space="preserve">IT Operations: </w:t>
+      </w:r>
+      <w:r>
+        <w:t>Incident &amp; Change Management, Patching, DR, Root Cause Analysis, L2/L3 Troubleshooting</w:t>
       </w:r>
     </w:p>
     <w:p>
@@ -220,7 +250,7 @@
           <w:b/>
         </w:rPr>
         <w:tab/>
-        <w:t>Current</w:t>
+        <w:t>Current Project</w:t>
       </w:r>
     </w:p>
     <w:p>
@@ -229,7 +259,7 @@
         <w:spacing w:after="20"/>
       </w:pPr>
       <w:r>
-        <w:t>Administer Active Directory for 10,000+ user accounts, resolving L3 identity and access escalations.</w:t>
+        <w:t>Deliver L3 Active Directory administration for 10,000+ users, resolving identity and access escalations.</w:t>
       </w:r>
     </w:p>
     <w:p>
@@ -238,7 +268,7 @@
         <w:spacing w:after="20"/>
       </w:pPr>
       <w:r>
-        <w:t>Monitor health and replication of 50+ Domain Controllers across multiple AD sites.</w:t>
+        <w:t>Manage health, replication and authentication across 50+ Domain Controllers and core AD DS services.</w:t>
       </w:r>
     </w:p>
     <w:p>
@@ -247,7 +277,7 @@
         <w:spacing w:after="20"/>
       </w:pPr>
       <w:r>
-        <w:t>Optimize Group Policy processing and security baselines for domain-joined users and computers.</w:t>
+        <w:t>Administer Group Policy (GPO): troubleshoot, validate and optimize policy application and security settings.</w:t>
       </w:r>
     </w:p>
     <w:p>
@@ -256,7 +286,7 @@
         <w:spacing w:after="20"/>
       </w:pPr>
       <w:r>
-        <w:t>Resolve LDAP, Kerberos/SPN, ACL and service-account issues that block application sign-in.</w:t>
+        <w:t>Maintain AD Sites and Services, subnets and replication topology for reliable connectivity across locations.</w:t>
       </w:r>
     </w:p>
     <w:p>
@@ -265,7 +295,25 @@
         <w:spacing w:after="20"/>
       </w:pPr>
       <w:r>
-        <w:t>Deliver Entra ID feature requests for enterprise apps, Conditional Access and RBAC, from design to closure.</w:t>
+        <w:t>Troubleshoot LDAP authentication, ACLs, delegation, service accounts and SPN / Kerberos access issues.</w:t>
+      </w:r>
+    </w:p>
+    <w:p>
+      <w:pPr>
+        <w:pStyle w:val="ListBullet"/>
+        <w:spacing w:after="20"/>
+      </w:pPr>
+      <w:r>
+        <w:t>Support Microsoft Entra ID enterprise application access, Conditional Access policies and RBAC roles.</w:t>
+      </w:r>
+    </w:p>
+    <w:p>
+      <w:pPr>
+        <w:pStyle w:val="ListBullet"/>
+        <w:spacing w:after="20"/>
+      </w:pPr>
+      <w:r>
+        <w:t>Handle incident and change activities for security access requests, from validation to closure.</w:t>
       </w:r>
     </w:p>
     <w:p>
@@ -287,7 +335,7 @@
           <w:b/>
         </w:rPr>
         <w:tab/>
-        <w:t>Previous</w:t>
+        <w:t>Previous Project</w:t>
       </w:r>
     </w:p>
     <w:p>
@@ -296,7 +344,7 @@
         <w:spacing w:after="20"/>
       </w:pPr>
       <w:r>
-        <w:t>Provisioned user and service accounts, groups and OUs using least-privilege delegation.</w:t>
+        <w:t>Provisioned AD user/service accounts, security and distribution groups, OUs and delegated access.</w:t>
       </w:r>
     </w:p>
     <w:p>
@@ -305,7 +353,7 @@
         <w:spacing w:after="20"/>
       </w:pPr>
       <w:r>
-        <w:t>Maintained Domain Controllers, AD-integrated DNS and replication; diagnosed authentication failures.</w:t>
+        <w:t>Administered Domain Controllers, DNS integration and AD replication; resolved authentication and replication issues.</w:t>
       </w:r>
     </w:p>
     <w:p>
@@ -314,7 +362,7 @@
         <w:spacing w:after="20"/>
       </w:pPr>
       <w:r>
-        <w:t>Rolled out MFA, Conditional Access and group-based licensing in Microsoft Entra ID.</w:t>
+        <w:t>Created, maintained and troubleshot Group Policy Objects (GPOs) to enforce security standards.</w:t>
       </w:r>
     </w:p>
     <w:p>
@@ -323,7 +371,7 @@
         <w:spacing w:after="20"/>
       </w:pPr>
       <w:r>
-        <w:t>Configured SAML single sign-on and Entra Connect hybrid synchronization.</w:t>
+        <w:t>Managed Microsoft Entra ID users and groups; implemented MFA, Conditional Access and group-based licensing.</w:t>
       </w:r>
     </w:p>
     <w:p>
@@ -332,7 +380,25 @@
         <w:spacing w:after="20"/>
       </w:pPr>
       <w:r>
-        <w:t>Ran DNS and DHCP operations: zones, forwarders, scopes, reservations and failover.</w:t>
+        <w:t>Configured SAML SSO and Microsoft Entra Connect for hybrid identity; reviewed audit and sign-in logs.</w:t>
+      </w:r>
+    </w:p>
+    <w:p>
+      <w:pPr>
+        <w:pStyle w:val="ListBullet"/>
+        <w:spacing w:after="20"/>
+      </w:pPr>
+      <w:r>
+        <w:t>Ran DNS and DHCP operations (records, forwarders, zone transfers, scopes, reservations, failover).</w:t>
+      </w:r>
+    </w:p>
+    <w:p>
+      <w:pPr>
+        <w:pStyle w:val="ListBullet"/>
+        <w:spacing w:after="20"/>
+      </w:pPr>
+      <w:r>
+        <w:t>Managed file-share and RBAC permissions and Exchange Online mailboxes, access and mail flow.</w:t>
       </w:r>
     </w:p>
     <w:p>
@@ -401,6 +467,9 @@
         <w:t>B.E., Computer Science and Engineering</w:t>
       </w:r>
       <w:r>
+        <w:t xml:space="preserve"> | Sri Venkateswara College of Engineering | CGPA: 9.23 / 10</w:t>
+      </w:r>
+      <w:r>
         <w:rPr>
           <w:b/>
         </w:rPr>
@@ -410,14 +479,26 @@
     </w:p>
     <w:p>
       <w:pPr>
-        <w:spacing w:after="40" w:before="0"/>
+        <w:tabs>
+          <w:tab w:pos="10181" w:val="right"/>
+        </w:tabs>
+        <w:spacing w:after="0" w:before="40"/>
       </w:pPr>
       <w:r>
         <w:rPr>
-          <w:b w:val="0"/>
-          <w:i w:val="0"/>
+          <w:b/>
         </w:rPr>
-        <w:t>Sri Venkateswara College of Engineering | CGPA 9.23/10</w:t>
+        <w:t>Higher Secondary (HSLC)</w:t>
+      </w:r>
+      <w:r>
+        <w:t xml:space="preserve"> | Holy Cross Anglo Indian Higher Secondary School | Score: 86%</w:t>
+      </w:r>
+      <w:r>
+        <w:rPr>
+          <w:b/>
+        </w:rPr>
+        <w:tab/>
+        <w:t>2016 – 2018</w:t>
       </w:r>
     </w:p>
     <w:p>
@@ -443,7 +524,7 @@
         <w:spacing w:after="20"/>
       </w:pPr>
       <w:r>
-        <w:t>Rising Star special mention for ticket resolution and team collaboration.</w:t>
+        <w:t>Top ticket-closure contributor in the core IT support team for fast, effective issue resolution.</w:t>
       </w:r>
     </w:p>
     <w:p>
@@ -452,7 +533,7 @@
         <w:spacing w:after="20"/>
       </w:pPr>
       <w:r>
-        <w:t>Top ticket-closure contributor in the core IT support team.</w:t>
+        <w:t>Received the Women Rising Star special mention for ticket resolution and team collaboration.</w:t>
       </w:r>
     </w:p>
     <w:p>
@@ -461,7 +542,16 @@
         <w:spacing w:after="20"/>
       </w:pPr>
       <w:r>
-        <w:t>Mentored new IT support hires on procedures and support workflows.</w:t>
+        <w:t>Collaborated with automation teams to streamline recurring service requests and improve efficiency.</w:t>
+      </w:r>
+    </w:p>
+    <w:p>
+      <w:pPr>
+        <w:pStyle w:val="ListBullet"/>
+        <w:spacing w:after="20"/>
+      </w:pPr>
+      <w:r>
+        <w:t>Trained and mentored new IT support hires on technical procedures and support workflows.</w:t>
       </w:r>
     </w:p>
     <w:sectPr>

</xml_diff>